<commit_message>
Replace vocab teacher with crop-verified words
</commit_message>
<xml_diff>
--- a/lesson7_vocab_teacher.docx
+++ b/lesson7_vocab_teacher.docx
@@ -250,7 +250,7 @@
                 <w:rFonts w:ascii="Calibri" w:hAnsi="Calibri"/>
                 <w:sz w:val="22"/>
               </w:rPr>
-              <w:t>pioneer</w:t>
+              <w:t>rules</w:t>
             </w:r>
           </w:p>
         </w:tc>
@@ -265,7 +265,7 @@
                 <w:b/>
                 <w:sz w:val="22"/>
               </w:rPr>
-              <w:t>P</w:t>
+              <w:t>T</w:t>
             </w:r>
           </w:p>
         </w:tc>
@@ -279,7 +279,7 @@
                 <w:rFonts w:ascii="Calibri" w:hAnsi="Calibri"/>
                 <w:sz w:val="22"/>
               </w:rPr>
-              <w:t>one of the first people to develop or do something new</w:t>
+              <w:t>instructions that tell you how to play a game or do something</w:t>
             </w:r>
           </w:p>
         </w:tc>
@@ -309,7 +309,7 @@
                 <w:rFonts w:ascii="Calibri" w:hAnsi="Calibri"/>
                 <w:sz w:val="22"/>
               </w:rPr>
-              <w:t>initiative</w:t>
+              <w:t>campaign</w:t>
             </w:r>
           </w:p>
         </w:tc>
@@ -338,7 +338,7 @@
                 <w:rFonts w:ascii="Calibri" w:hAnsi="Calibri"/>
                 <w:sz w:val="22"/>
               </w:rPr>
-              <w:t>a new plan or action to achieve a goal</w:t>
+              <w:t>a planned set of activities to achieve a particular goal</w:t>
             </w:r>
           </w:p>
         </w:tc>
@@ -368,7 +368,7 @@
                 <w:rFonts w:ascii="Calibri" w:hAnsi="Calibri"/>
                 <w:sz w:val="22"/>
               </w:rPr>
-              <w:t>stewardship</w:t>
+              <w:t>recycling</w:t>
             </w:r>
           </w:p>
         </w:tc>
@@ -383,7 +383,7 @@
                 <w:b/>
                 <w:sz w:val="22"/>
               </w:rPr>
-              <w:t>B</w:t>
+              <w:t>P</w:t>
             </w:r>
           </w:p>
         </w:tc>
@@ -397,7 +397,7 @@
                 <w:rFonts w:ascii="Calibri" w:hAnsi="Calibri"/>
                 <w:sz w:val="22"/>
               </w:rPr>
-              <w:t>the job of taking care of something important</w:t>
+              <w:t>the process of collecting waste and turning it into something new</w:t>
             </w:r>
           </w:p>
         </w:tc>
@@ -1076,7 +1076,7 @@
                 <w:rFonts w:ascii="Calibri" w:hAnsi="Calibri"/>
                 <w:sz w:val="22"/>
               </w:rPr>
-              <w:t>undesirable</w:t>
+              <w:t>negative</w:t>
             </w:r>
           </w:p>
         </w:tc>
@@ -1105,7 +1105,7 @@
                 <w:rFonts w:ascii="Calibri" w:hAnsi="Calibri"/>
                 <w:sz w:val="22"/>
               </w:rPr>
-              <w:t>not wanted or pleasing; negative</w:t>
+              <w:t>bad or harmful; expressing disagreement or refusal</w:t>
             </w:r>
           </w:p>
         </w:tc>
@@ -1135,7 +1135,7 @@
                 <w:rFonts w:ascii="Calibri" w:hAnsi="Calibri"/>
                 <w:sz w:val="22"/>
               </w:rPr>
-              <w:t>unwittingly</w:t>
+              <w:t>evidence</w:t>
             </w:r>
           </w:p>
         </w:tc>
@@ -1164,7 +1164,7 @@
                 <w:rFonts w:ascii="Calibri" w:hAnsi="Calibri"/>
                 <w:sz w:val="22"/>
               </w:rPr>
-              <w:t>without realizing or intending to do something</w:t>
+              <w:t>information or facts that show something is true</w:t>
             </w:r>
           </w:p>
         </w:tc>
@@ -1209,7 +1209,7 @@
                 <w:b/>
                 <w:sz w:val="22"/>
               </w:rPr>
-              <w:t>T</w:t>
+              <w:t>B</w:t>
             </w:r>
           </w:p>
         </w:tc>

</xml_diff>